<commit_message>
TS 2.5 Ghanam Jatai Tamil
</commit_message>
<xml_diff>
--- a/TS Jatai Ghanam Project/TS 2.5/TS 2.5 Jatai Tamil Corrections.docx
+++ b/TS Jatai Ghanam Project/TS 2.5/TS 2.5 Jatai Tamil Corrections.docx
@@ -70,10 +70,9 @@
           <w:bCs/>
           <w:sz w:val="32"/>
           <w:szCs w:val="32"/>
-          <w:highlight w:val="red"/>
           <w:u w:val="single"/>
         </w:rPr>
-        <w:t>??????</w:t>
+        <w:t>31st July 2026</w:t>
       </w:r>
     </w:p>
     <w:p>
@@ -338,6 +337,24 @@
             </w:r>
             <w:r>
               <w:rPr>
+                <w:rFonts w:ascii="BRH Malayalam Extra" w:hAnsi="BRH Malayalam Extra" w:cs="BRH Devanagari Extra"/>
+                <w:color w:val="000000"/>
+                <w:szCs w:val="40"/>
+              </w:rPr>
+              <w:t>–</w:t>
+            </w:r>
+            <w:r>
+              <w:rPr>
+                <w:rFonts w:ascii="BRH Tamil Tab Extra" w:hAnsi="BRH Tamil Tab Extra" w:cs="Latha"/>
+                <w:b/>
+                <w:bCs/>
+                <w:szCs w:val="28"/>
+                <w:lang w:bidi="ta-IN"/>
+              </w:rPr>
+              <w:t>…</w:t>
+            </w:r>
+            <w:r>
+              <w:rPr>
                 <w:rFonts w:ascii="BRH Tamil Tab Extra" w:hAnsi="BRH Tamil Tab Extra" w:cs="Latha"/>
                 <w:b/>
                 <w:bCs/>
@@ -400,103 +417,125 @@
               <w:adjustRightInd w:val="0"/>
               <w:spacing w:before="0" w:line="240" w:lineRule="auto"/>
               <w:rPr>
+                <w:rFonts w:ascii="Latha" w:hAnsi="Latha" w:cs="Latha"/>
+                <w:szCs w:val="24"/>
+                <w:lang w:bidi="ta-IN"/>
+              </w:rPr>
+            </w:pPr>
+            <w:r>
+              <w:rPr>
+                <w:rFonts w:ascii="Latha" w:hAnsi="Latha" w:cs="Latha"/>
+                <w:szCs w:val="24"/>
+                <w:cs/>
+                <w:lang w:bidi="ta-IN"/>
+              </w:rPr>
+              <w:t>பி</w:t>
+            </w:r>
+            <w:r>
+              <w:rPr>
+                <w:rFonts w:ascii="BRH Malayalam Extra" w:hAnsi="BRH Malayalam Extra" w:cs="BRH Devanagari Extra"/>
+                <w:color w:val="000000"/>
+                <w:szCs w:val="40"/>
+              </w:rPr>
+              <w:t>–</w:t>
+            </w:r>
+            <w:r>
+              <w:rPr>
+                <w:rFonts w:ascii="BRH Tamil Tab Extra" w:hAnsi="BRH Tamil Tab Extra" w:cs="Latha"/>
+                <w:b/>
+                <w:bCs/>
+                <w:szCs w:val="28"/>
+                <w:lang w:bidi="ta-IN"/>
+              </w:rPr>
+              <w:t>…</w:t>
+            </w:r>
+            <w:r>
+              <w:rPr>
+                <w:rFonts w:ascii="Latha" w:hAnsi="Latha" w:cs="Latha"/>
+                <w:szCs w:val="24"/>
+                <w:cs/>
+                <w:lang w:bidi="ta-IN"/>
+              </w:rPr>
+              <w:t>ப</w:t>
+            </w:r>
+            <w:r>
+              <w:rPr>
+                <w:rFonts w:ascii="BRH Tamil Tab Extra" w:hAnsi="BRH Tamil Tab Extra" w:cs="Latha"/>
+                <w:b/>
+                <w:bCs/>
+                <w:szCs w:val="28"/>
+                <w:lang w:bidi="ta-IN"/>
+              </w:rPr>
+              <w:t>…</w:t>
+            </w:r>
+            <w:r>
+              <w:rPr>
+                <w:rFonts w:ascii="Latha" w:hAnsi="Latha" w:cs="Latha"/>
+                <w:color w:val="EE0000"/>
+                <w:szCs w:val="24"/>
+                <w:highlight w:val="yellow"/>
+                <w:cs/>
+                <w:lang w:bidi="ta-IN"/>
+              </w:rPr>
+              <w:t>த</w:t>
+            </w:r>
+            <w:r>
+              <w:rPr>
+                <w:rFonts w:ascii="Latha" w:hAnsi="Latha" w:cs="Latha"/>
+                <w:szCs w:val="24"/>
+                <w:cs/>
+                <w:lang w:bidi="ta-IN"/>
+              </w:rPr>
+              <w:t xml:space="preserve"> இதி</w:t>
+            </w:r>
+            <w:r>
+              <w:rPr>
+                <w:rFonts w:ascii="BRH Tamil Tab Extra" w:hAnsi="BRH Tamil Tab Extra" w:cs="Latha"/>
+                <w:b/>
+                <w:bCs/>
+                <w:szCs w:val="28"/>
+                <w:lang w:bidi="ta-IN"/>
+              </w:rPr>
+              <w:t>†</w:t>
+            </w:r>
+            <w:r>
+              <w:rPr>
+                <w:rFonts w:ascii="Latha" w:hAnsi="Latha" w:cs="Latha"/>
+                <w:szCs w:val="24"/>
+                <w:lang w:bidi="ta-IN"/>
+              </w:rPr>
+              <w:t xml:space="preserve"> </w:t>
+            </w:r>
+            <w:r>
+              <w:rPr>
+                <w:rFonts w:ascii="Latha" w:hAnsi="Latha" w:cs="Latha"/>
+                <w:szCs w:val="24"/>
+                <w:cs/>
+                <w:lang w:bidi="ta-IN"/>
+              </w:rPr>
+              <w:t xml:space="preserve">பிபதே </w:t>
+            </w:r>
+            <w:r>
+              <w:rPr>
+                <w:rFonts w:ascii="Latha" w:hAnsi="Latha" w:cs="Latha"/>
+                <w:szCs w:val="24"/>
+                <w:lang w:bidi="ta-IN"/>
+              </w:rPr>
+              <w:t xml:space="preserve">| </w:t>
+            </w:r>
+          </w:p>
+          <w:p>
+            <w:pPr>
+              <w:autoSpaceDE w:val="0"/>
+              <w:autoSpaceDN w:val="0"/>
+              <w:adjustRightInd w:val="0"/>
+              <w:spacing w:before="0" w:line="240" w:lineRule="auto"/>
+              <w:rPr>
                 <w:rFonts w:cs="BRH Malayalam Extra"/>
                 <w:color w:val="000000"/>
                 <w:szCs w:val="40"/>
               </w:rPr>
             </w:pPr>
-            <w:r>
-              <w:rPr>
-                <w:rFonts w:ascii="Latha" w:hAnsi="Latha" w:cs="Latha"/>
-                <w:szCs w:val="24"/>
-                <w:cs/>
-                <w:lang w:bidi="ta-IN"/>
-              </w:rPr>
-              <w:t>பி</w:t>
-            </w:r>
-            <w:r>
-              <w:rPr>
-                <w:rFonts w:ascii="BRH Tamil Tab Extra" w:hAnsi="BRH Tamil Tab Extra" w:cs="Latha"/>
-                <w:b/>
-                <w:bCs/>
-                <w:szCs w:val="28"/>
-                <w:lang w:bidi="ta-IN"/>
-              </w:rPr>
-              <w:t>…</w:t>
-            </w:r>
-            <w:r>
-              <w:rPr>
-                <w:rFonts w:ascii="Latha" w:hAnsi="Latha" w:cs="Latha"/>
-                <w:szCs w:val="24"/>
-                <w:cs/>
-                <w:lang w:bidi="ta-IN"/>
-              </w:rPr>
-              <w:t>ப</w:t>
-            </w:r>
-            <w:r>
-              <w:rPr>
-                <w:rFonts w:ascii="BRH Tamil Tab Extra" w:hAnsi="BRH Tamil Tab Extra" w:cs="Latha"/>
-                <w:b/>
-                <w:bCs/>
-                <w:szCs w:val="28"/>
-                <w:lang w:bidi="ta-IN"/>
-              </w:rPr>
-              <w:t>…</w:t>
-            </w:r>
-            <w:r>
-              <w:rPr>
-                <w:rFonts w:ascii="Latha" w:hAnsi="Latha" w:cs="Latha"/>
-                <w:szCs w:val="24"/>
-                <w:highlight w:val="yellow"/>
-                <w:cs/>
-                <w:lang w:bidi="ta-IN"/>
-              </w:rPr>
-              <w:t>த</w:t>
-            </w:r>
-            <w:r>
-              <w:rPr>
-                <w:rFonts w:ascii="Latha" w:hAnsi="Latha" w:cs="Latha"/>
-                <w:szCs w:val="24"/>
-                <w:cs/>
-                <w:lang w:bidi="ta-IN"/>
-              </w:rPr>
-              <w:t xml:space="preserve"> இதி</w:t>
-            </w:r>
-            <w:r>
-              <w:rPr>
-                <w:rFonts w:ascii="BRH Tamil Tab Extra" w:hAnsi="BRH Tamil Tab Extra" w:cs="Latha"/>
-                <w:b/>
-                <w:bCs/>
-                <w:szCs w:val="28"/>
-                <w:lang w:bidi="ta-IN"/>
-              </w:rPr>
-              <w:t>†</w:t>
-            </w:r>
-            <w:r>
-              <w:rPr>
-                <w:rFonts w:ascii="Latha" w:hAnsi="Latha" w:cs="Latha"/>
-                <w:szCs w:val="24"/>
-                <w:lang w:bidi="ta-IN"/>
-              </w:rPr>
-              <w:t xml:space="preserve"> </w:t>
-            </w:r>
-            <w:r>
-              <w:rPr>
-                <w:rFonts w:ascii="Latha" w:hAnsi="Latha" w:cs="Latha"/>
-                <w:szCs w:val="24"/>
-                <w:cs/>
-                <w:lang w:bidi="ta-IN"/>
-              </w:rPr>
-              <w:t xml:space="preserve">பிபதே </w:t>
-            </w:r>
-            <w:r>
-              <w:rPr>
-                <w:rFonts w:ascii="Latha" w:hAnsi="Latha" w:cs="Latha"/>
-                <w:szCs w:val="24"/>
-                <w:lang w:bidi="ta-IN"/>
-              </w:rPr>
-              <w:t xml:space="preserve">| </w:t>
-            </w:r>
           </w:p>
         </w:tc>
         <w:tc>
@@ -754,6 +793,14 @@
                 <w:lang w:bidi="ta-IN"/>
               </w:rPr>
               <w:t>…</w:t>
+            </w:r>
+            <w:r>
+              <w:rPr>
+                <w:rFonts w:ascii="BRH Malayalam Extra" w:hAnsi="BRH Malayalam Extra" w:cs="BRH Devanagari Extra"/>
+                <w:color w:val="000000"/>
+                <w:szCs w:val="40"/>
+              </w:rPr>
+              <w:t>–</w:t>
             </w:r>
             <w:r>
               <w:rPr>
@@ -854,6 +901,16 @@
           <w:u w:val="single"/>
         </w:rPr>
       </w:pPr>
+      <w:r>
+        <w:rPr>
+          <w:b/>
+          <w:bCs/>
+          <w:sz w:val="32"/>
+          <w:szCs w:val="32"/>
+          <w:u w:val="single"/>
+        </w:rPr>
+        <w:t>======================</w:t>
+      </w:r>
     </w:p>
     <w:p>
       <w:pPr>
@@ -8183,7 +8240,17 @@
                 <w:cs/>
                 <w:lang w:bidi="ta-IN"/>
               </w:rPr>
-              <w:t>ஜேத யஜேத ஸாகம்ப்ரஸ்தா</w:t>
+              <w:t xml:space="preserve">ஜேத யஜேத </w:t>
+            </w:r>
+            <w:r>
+              <w:rPr>
+                <w:rFonts w:ascii="Latha" w:hAnsi="Latha" w:cs="Latha"/>
+                <w:szCs w:val="24"/>
+                <w:cs/>
+                <w:lang w:bidi="ta-IN"/>
+              </w:rPr>
+              <w:lastRenderedPageBreak/>
+              <w:t>ஸாகம்ப்ரஸ்தா</w:t>
             </w:r>
             <w:r>
               <w:rPr>
@@ -10100,7 +10167,17 @@
                 <w:cs/>
                 <w:lang w:bidi="ta-IN"/>
               </w:rPr>
-              <w:t>ஜேத யஜேத ஸாகம்ப்ரஸ்தா</w:t>
+              <w:t xml:space="preserve">ஜேத யஜேத </w:t>
+            </w:r>
+            <w:r>
+              <w:rPr>
+                <w:rFonts w:ascii="Latha" w:hAnsi="Latha" w:cs="Latha"/>
+                <w:szCs w:val="24"/>
+                <w:cs/>
+                <w:lang w:bidi="ta-IN"/>
+              </w:rPr>
+              <w:lastRenderedPageBreak/>
+              <w:t>ஸாகம்ப்ரஸ்தா</w:t>
             </w:r>
             <w:r>
               <w:rPr>
@@ -10250,7 +10327,6 @@
                 <w:cs/>
                 <w:lang w:bidi="ta-IN"/>
               </w:rPr>
-              <w:lastRenderedPageBreak/>
               <w:t>ய</w:t>
             </w:r>
             <w:r>
@@ -13683,6 +13759,7 @@
                 <w:cs/>
                 <w:lang w:bidi="ta-IN"/>
               </w:rPr>
+              <w:lastRenderedPageBreak/>
               <w:t>36</w:t>
             </w:r>
             <w:r>
@@ -16251,7 +16328,6 @@
                 <w:cs/>
                 <w:lang w:bidi="ta-IN"/>
               </w:rPr>
-              <w:lastRenderedPageBreak/>
               <w:t>32</w:t>
             </w:r>
             <w:r>
@@ -18917,6 +18993,7 @@
                 <w:cs/>
                 <w:lang w:bidi="ta-IN"/>
               </w:rPr>
+              <w:lastRenderedPageBreak/>
               <w:t>க்</w:t>
             </w:r>
             <w:r>
@@ -19192,6 +19269,7 @@
                 <w:cs/>
                 <w:lang w:bidi="ta-IN"/>
               </w:rPr>
+              <w:lastRenderedPageBreak/>
               <w:t>26</w:t>
             </w:r>
             <w:r>
@@ -20704,6 +20782,7 @@
                 <w:cs/>
                 <w:lang w:bidi="ta-IN"/>
               </w:rPr>
+              <w:lastRenderedPageBreak/>
               <w:t>க்</w:t>
             </w:r>
             <w:r>
@@ -35411,7 +35490,18 @@
           <w:szCs w:val="32"/>
           <w:u w:val="single"/>
         </w:rPr>
-        <w:t xml:space="preserve"> prior to </w:t>
+        <w:t xml:space="preserve"> prior </w:t>
+      </w:r>
+      <w:proofErr w:type="gramStart"/>
+      <w:r>
+        <w:rPr>
+          <w:b/>
+          <w:bCs/>
+          <w:sz w:val="32"/>
+          <w:szCs w:val="32"/>
+          <w:u w:val="single"/>
+        </w:rPr>
+        <w:t xml:space="preserve">to </w:t>
       </w:r>
       <w:r>
         <w:rPr>
@@ -35423,6 +35513,7 @@
         </w:rPr>
         <w:t xml:space="preserve"> 31</w:t>
       </w:r>
+      <w:proofErr w:type="gramEnd"/>
       <w:r>
         <w:rPr>
           <w:b/>

</xml_diff>